<commit_message>
Updates  ro git, PC and linux
</commit_message>
<xml_diff>
--- a/Initial_PC_Install.docx
+++ b/Initial_PC_Install.docx
@@ -106,6 +106,112 @@
         </w:r>
       </w:hyperlink>
     </w:p>
+    <w:p>
+      <w:hyperlink r:id="rId8" w:history="1">
+        <w:r>
+          <w:rPr>
+            <w:rStyle w:val="Hyperlink"/>
+          </w:rPr>
+          <w:t>Basic commands for WSL | Microsoft Learn</w:t>
+        </w:r>
+      </w:hyperlink>
+    </w:p>
+    <w:p>
+      <w:hyperlink r:id="rId9" w:history="1">
+        <w:r>
+          <w:rPr>
+            <w:rStyle w:val="Hyperlink"/>
+          </w:rPr>
+          <w:t>Set up the Visual Studio Code WSL extension - Training | Microsoft Learn</w:t>
+        </w:r>
+      </w:hyperlink>
+    </w:p>
+    <w:p>
+      <w:r>
+        <w:tab/>
+      </w:r>
+      <w:r>
+        <w:tab/>
+      </w:r>
+      <w:r>
+        <w:tab/>
+      </w:r>
+      <w:r>
+        <w:tab/>
+      </w:r>
+    </w:p>
+    <w:tbl>
+      <w:tblPr>
+        <w:tblStyle w:val="TableGrid"/>
+        <w:tblW w:w="0" w:type="auto"/>
+        <w:tblBorders>
+          <w:top w:val="none" w:sz="0" w:space="0" w:color="auto"/>
+          <w:left w:val="none" w:sz="0" w:space="0" w:color="auto"/>
+          <w:bottom w:val="none" w:sz="0" w:space="0" w:color="auto"/>
+          <w:right w:val="none" w:sz="0" w:space="0" w:color="auto"/>
+          <w:insideH w:val="none" w:sz="0" w:space="0" w:color="auto"/>
+          <w:insideV w:val="none" w:sz="0" w:space="0" w:color="auto"/>
+        </w:tblBorders>
+        <w:tblLook w:val="04A0" w:firstRow="1" w:lastRow="0" w:firstColumn="1" w:lastColumn="0" w:noHBand="0" w:noVBand="1"/>
+      </w:tblPr>
+      <w:tblGrid>
+        <w:gridCol w:w="3145"/>
+        <w:gridCol w:w="6205"/>
+      </w:tblGrid>
+      <w:tr>
+        <w:tc>
+          <w:tcPr>
+            <w:tcW w:w="3145" w:type="dxa"/>
+          </w:tcPr>
+          <w:p>
+            <w:pPr>
+              <w:jc w:val="center"/>
+            </w:pPr>
+            <w:r>
+              <w:t>For future consideration</w:t>
+            </w:r>
+          </w:p>
+        </w:tc>
+        <w:tc>
+          <w:tcPr>
+            <w:tcW w:w="6205" w:type="dxa"/>
+          </w:tcPr>
+          <w:p>
+            <w:hyperlink r:id="rId10" w:history="1">
+              <w:r>
+                <w:rPr>
+                  <w:rStyle w:val="Hyperlink"/>
+                </w:rPr>
+                <w:t>What distro is the best to learn RedHat enterprise on, without using RedHat enterprise</w:t>
+              </w:r>
+              <w:proofErr w:type="gramStart"/>
+              <w:r>
+                <w:rPr>
+                  <w:rStyle w:val="Hyperlink"/>
+                </w:rPr>
+                <w:t>? :</w:t>
+              </w:r>
+              <w:proofErr w:type="gramEnd"/>
+              <w:r>
+                <w:rPr>
+                  <w:rStyle w:val="Hyperlink"/>
+                </w:rPr>
+                <w:t xml:space="preserve"> r/</w:t>
+              </w:r>
+              <w:proofErr w:type="spellStart"/>
+              <w:r>
+                <w:rPr>
+                  <w:rStyle w:val="Hyperlink"/>
+                </w:rPr>
+                <w:t>linuxquestions</w:t>
+              </w:r>
+              <w:proofErr w:type="spellEnd"/>
+            </w:hyperlink>
+          </w:p>
+        </w:tc>
+      </w:tr>
+    </w:tbl>
+    <w:p/>
     <w:p/>
     <w:p>
       <w:r>
@@ -197,6 +303,7 @@
     </w:p>
     <w:p>
       <w:r>
+        <w:lastRenderedPageBreak/>
         <w:t>PS C:\Windows\system32&gt;wsl.exe  --install Ubuntu</w:t>
       </w:r>
     </w:p>
@@ -248,7 +355,6 @@
           <w:sz w:val="20"/>
           <w:szCs w:val="20"/>
         </w:rPr>
-        <w:lastRenderedPageBreak/>
         <w:t>total 16</w:t>
       </w:r>
     </w:p>
@@ -563,7 +669,7 @@
           <w:szCs w:val="20"/>
         </w:rPr>
       </w:pPr>
-      <w:hyperlink r:id="rId8" w:history="1">
+      <w:hyperlink r:id="rId11" w:history="1">
         <w:r>
           <w:rPr>
             <w:rStyle w:val="Hyperlink"/>
@@ -626,7 +732,7 @@
         </w:rPr>
         <w:t xml:space="preserve">#sudo wget </w:t>
       </w:r>
-      <w:hyperlink r:id="rId9" w:history="1">
+      <w:hyperlink r:id="rId12" w:history="1">
         <w:r>
           <w:rPr>
             <w:rStyle w:val="Hyperlink"/>
@@ -847,6 +953,7 @@
           <w:sz w:val="16"/>
           <w:szCs w:val="16"/>
         </w:rPr>
+        <w:lastRenderedPageBreak/>
         <w:t>export PATH</w:t>
       </w:r>
     </w:p>
@@ -872,7 +979,7 @@
       <w:pPr>
         <w:pStyle w:val="NoSpacing"/>
       </w:pPr>
-      <w:hyperlink r:id="rId10" w:history="1">
+      <w:hyperlink r:id="rId13" w:history="1">
         <w:r>
           <w:rPr>
             <w:rStyle w:val="Hyperlink"/>
@@ -936,7 +1043,9 @@
         <w:pStyle w:val="NoSpacing"/>
       </w:pPr>
       <w:r>
-        <w:lastRenderedPageBreak/>
+        <w:rPr>
+          <w:noProof/>
+        </w:rPr>
         <w:drawing>
           <wp:inline distT="0" distB="0" distL="0" distR="0" wp14:anchorId="2CC68820" wp14:editId="214DA91A">
             <wp:extent cx="5943600" cy="3126740"/>
@@ -953,7 +1062,7 @@
                     <pic:cNvPicPr/>
                   </pic:nvPicPr>
                   <pic:blipFill>
-                    <a:blip r:embed="rId11"/>
+                    <a:blip r:embed="rId14"/>
                     <a:stretch>
                       <a:fillRect/>
                     </a:stretch>
@@ -1708,7 +1817,6 @@
   <w:style w:type="character" w:default="1" w:styleId="DefaultParagraphFont">
     <w:name w:val="Default Paragraph Font"/>
     <w:uiPriority w:val="1"/>
-    <w:semiHidden/>
     <w:unhideWhenUsed/>
   </w:style>
   <w:style w:type="table" w:default="1" w:styleId="TableNormal">
@@ -2053,6 +2161,25 @@
     <w:pPr>
       <w:spacing w:after="0" w:line="240" w:lineRule="auto"/>
     </w:pPr>
+  </w:style>
+  <w:style w:type="table" w:styleId="TableGrid">
+    <w:name w:val="Table Grid"/>
+    <w:basedOn w:val="TableNormal"/>
+    <w:uiPriority w:val="39"/>
+    <w:rsid w:val="006F655B"/>
+    <w:pPr>
+      <w:spacing w:after="0" w:line="240" w:lineRule="auto"/>
+    </w:pPr>
+    <w:tblPr>
+      <w:tblBorders>
+        <w:top w:val="single" w:sz="4" w:space="0" w:color="auto"/>
+        <w:left w:val="single" w:sz="4" w:space="0" w:color="auto"/>
+        <w:bottom w:val="single" w:sz="4" w:space="0" w:color="auto"/>
+        <w:right w:val="single" w:sz="4" w:space="0" w:color="auto"/>
+        <w:insideH w:val="single" w:sz="4" w:space="0" w:color="auto"/>
+        <w:insideV w:val="single" w:sz="4" w:space="0" w:color="auto"/>
+      </w:tblBorders>
+    </w:tblPr>
   </w:style>
 </w:styles>
 </file>

</xml_diff>